<commit_message>
Update PRD to v1.3: starred notes and web access (v1.1)
- 3.2 Non-Goals: mobile native deferred, web/PWA now v1.1
- 6.4.1 Sidebar: add Starred to fixed filter list
- 6.10 Starred Notes: document star feature and frontmatter storage
- 6.11 Web Access / PWA: architecture, deployment, IP/HTTPS options, feature parity, project structure
- 7.4 Web Server Architecture: axum pipeline, auth, static serving, vault isolation

Co-Authored-By: Claude Sonnet 4.6 <noreply@anthropic.com>
</commit_message>
<xml_diff>
--- a/vault_prd.docx
+++ b/vault_prd.docx
@@ -59,7 +59,7 @@
           <w:sz w:val="22"/>
           <w:szCs w:val="22"/>
         </w:rPr>
-        <w:t xml:space="preserve">Version 1.0  |  June 2026  |  Draft</w:t>
+        <w:t>Version 1.3  |  June 2026  |  Draft</w:t>
       </w:r>
     </w:p>
     <w:tbl>
@@ -760,7 +760,7 @@
         <w:spacing w:after="60"/>
       </w:pPr>
       <w:r>
-        <w:t xml:space="preserve">Mobile apps (iOS/Android) — deferred to post-v1</w:t>
+        <w:t>Native mobile apps (iOS/Android) — native Tauri iOS deferred to post-v1; web/PWA access via the companion server is v1.1</w:t>
       </w:r>
     </w:p>
     <w:p>
@@ -3286,7 +3286,7 @@
         <w:spacing w:after="60"/>
       </w:pPr>
       <w:r>
-        <w:t xml:space="preserve">Fixed filters at the top: All Notes, Inbox (untyped notes), Changes (modified files), Pulse (git activity feed)</w:t>
+        <w:t>Fixed filters at the top: All Notes, Inbox (untyped notes), Starred (bookmarked notes), Changes (modified files), Pulse (git activity feed)</w:t>
       </w:r>
     </w:p>
     <w:p>
@@ -4658,6 +4658,204 @@
       </w:pPr>
       <w:r>
         <w:t xml:space="preserve"/>
+      </w:r>
+    </w:p>
+    <w:p>
+      <w:r>
+        <w:t>6.10 Starred Notes</w:t>
+      </w:r>
+    </w:p>
+    <w:p>
+      <w:r>
+        <w:t>Users can star any note to bookmark it for quick access. Stars are stored as starred: true in the note's YAML frontmatter, making them portable and version-controlled like all other metadata.</w:t>
+      </w:r>
+    </w:p>
+    <w:p>
+      <w:r>
+        <w:t>A Starred filter appears in the sidebar with a live count. The star button appears on each note in the note list on hover (filled amber when starred). Clicking toggles the state without opening the note.</w:t>
+      </w:r>
+    </w:p>
+    <w:p>
+      <w:r>
+        <w:t>6.11 Web Access / PWA (v1.1)</w:t>
+      </w:r>
+    </w:p>
+    <w:p>
+      <w:r>
+        <w:t>Vault v1.1 introduces a companion web server so the app can be accessed from any browser — including iPhone Safari — without a native app install.</w:t>
+      </w:r>
+    </w:p>
+    <w:p>
+      <w:r>
+        <w:t>6.11.1 Architecture</w:t>
+      </w:r>
+    </w:p>
+    <w:p>
+      <w:r>
+        <w:t>The Tauri desktop app is unchanged. The same Rust core logic (vault, git, search, settings) is extracted into a shared library crate. A new standalone axum HTTP server exposes it as a REST API. The React frontend is built twice: once for Tauri (using invoke() IPC) and once for web (using fetch() IPC), controlled by a VITE_BUILD_TARGET=web environment variable at build time.</w:t>
+      </w:r>
+    </w:p>
+    <w:p>
+      <w:r>
+        <w:t>6.11.2 Deployment</w:t>
+      </w:r>
+    </w:p>
+    <w:p>
+      <w:r>
+        <w:t>The web server is designed for self-hosting on a personal VPS (e.g. Hostinger). It is configured entirely via environment variables:</w:t>
+      </w:r>
+    </w:p>
+    <w:p>
+      <w:pPr>
+        <w:pStyle w:val="ListParagraph"/>
+      </w:pPr>
+      <w:r>
+        <w:t>VAULT_PATH — absolute path to the vault directory on the server (e.g. /home/user/notes)</w:t>
+      </w:r>
+    </w:p>
+    <w:p>
+      <w:pPr>
+        <w:pStyle w:val="ListParagraph"/>
+      </w:pPr>
+      <w:r>
+        <w:t>VAULT_TOKEN — secret bearer token; all API requests must include Authorization: Bearer &lt;token&gt;</w:t>
+      </w:r>
+    </w:p>
+    <w:p>
+      <w:pPr>
+        <w:pStyle w:val="ListParagraph"/>
+      </w:pPr>
+      <w:r>
+        <w:t>PORT — port to listen on (default 8080)</w:t>
+      </w:r>
+    </w:p>
+    <w:p>
+      <w:r>
+        <w:t>The server serves the built React frontend as static files on /, and the API on /api/*. It can sit behind nginx for SSL termination, or be accessed directly on its port.</w:t>
+      </w:r>
+    </w:p>
+    <w:p>
+      <w:r>
+        <w:t>6.11.3 HTTPS &amp; IP Address Hosting</w:t>
+      </w:r>
+    </w:p>
+    <w:p>
+      <w:r>
+        <w:t>The server runs on a bare IP address without requiring a domain name. Three HTTPS options are available:</w:t>
+      </w:r>
+    </w:p>
+    <w:p>
+      <w:pPr>
+        <w:pStyle w:val="ListParagraph"/>
+      </w:pPr>
+      <w:r>
+        <w:t>Plain HTTP on port 8080 — simplest setup, no certificate needed. Works in Safari but Add to Home Screen PWA features are restricted by iOS without HTTPS.</w:t>
+      </w:r>
+    </w:p>
+    <w:p>
+      <w:pPr>
+        <w:pStyle w:val="ListParagraph"/>
+      </w:pPr>
+      <w:r>
+        <w:t>Self-signed TLS certificate — generated on first start. The user installs it as a trusted profile on their iPhone once (Settings → General → VPN &amp; Device Management → Install Certificate). Full PWA features enabled.</w:t>
+      </w:r>
+    </w:p>
+    <w:p>
+      <w:pPr>
+        <w:pStyle w:val="ListParagraph"/>
+      </w:pPr>
+      <w:r>
+        <w:t>Domain + Let's Encrypt — if the user later points a domain at the VPS IP, certbot can issue a free trusted certificate automatically. Recommended for long-term use.</w:t>
+      </w:r>
+    </w:p>
+    <w:p>
+      <w:r>
+        <w:t>6.11.4 Features Available on Web</w:t>
+      </w:r>
+    </w:p>
+    <w:p>
+      <w:pPr>
+        <w:pStyle w:val="ListParagraph"/>
+      </w:pPr>
+      <w:r>
+        <w:t>Note editing (rich and raw), search, inspector, wikilinks, backlinks, starred notes — full parity with desktop.</w:t>
+      </w:r>
+    </w:p>
+    <w:p>
+      <w:pPr>
+        <w:pStyle w:val="ListParagraph"/>
+      </w:pPr>
+      <w:r>
+        <w:t>Git commit and sync to remote (GitHub, GitLab, etc.) — full parity.</w:t>
+      </w:r>
+    </w:p>
+    <w:p>
+      <w:pPr>
+        <w:pStyle w:val="ListParagraph"/>
+      </w:pPr>
+      <w:r>
+        <w:t>Vault picker / WelcomeScreen — replaced by a simple connection screen; vault path is fixed to VAULT_PATH on the server.</w:t>
+      </w:r>
+    </w:p>
+    <w:p>
+      <w:pPr>
+        <w:pStyle w:val="ListParagraph"/>
+      </w:pPr>
+      <w:r>
+        <w:t>Multi-window (Cmd+Shift+O) — not available in browser context.</w:t>
+      </w:r>
+    </w:p>
+    <w:p>
+      <w:pPr>
+        <w:pStyle w:val="ListParagraph"/>
+      </w:pPr>
+      <w:r>
+        <w:t>Offline use — requires internet connection to reach the VPS.</w:t>
+      </w:r>
+    </w:p>
+    <w:p>
+      <w:r>
+        <w:t>6.11.5 Project Structure Changes</w:t>
+      </w:r>
+    </w:p>
+    <w:p>
+      <w:pPr>
+        <w:pStyle w:val="ListParagraph"/>
+      </w:pPr>
+      <w:r>
+        <w:t>core/ — new shared Rust library crate (vault, git, search, settings modules)</w:t>
+      </w:r>
+    </w:p>
+    <w:p>
+      <w:pPr>
+        <w:pStyle w:val="ListParagraph"/>
+      </w:pPr>
+      <w:r>
+        <w:t>src-tauri/ — unchanged except Cargo.toml gains a path dependency on core/</w:t>
+      </w:r>
+    </w:p>
+    <w:p>
+      <w:pPr>
+        <w:pStyle w:val="ListParagraph"/>
+      </w:pPr>
+      <w:r>
+        <w:t>server/ — new axum binary crate; thin HTTP layer over core/ with bearer token auth</w:t>
+      </w:r>
+    </w:p>
+    <w:p>
+      <w:pPr>
+        <w:pStyle w:val="ListParagraph"/>
+      </w:pPr>
+      <w:r>
+        <w:t>src/lib/ipc.web.ts — fetch()-based IPC implementation for the web build</w:t>
+      </w:r>
+    </w:p>
+    <w:p>
+      <w:pPr>
+        <w:pStyle w:val="ListParagraph"/>
+      </w:pPr>
+      <w:r>
+        <w:t>vite.config.web.ts — Vite config for the web build; aliases ipc.ts to ipc.web.ts</w:t>
       </w:r>
     </w:p>
     <w:p>
@@ -5919,6 +6117,41 @@
       </w:r>
     </w:p>
     <w:p>
+      <w:r>
+        <w:t>7.4 Web Server Architecture</w:t>
+      </w:r>
+    </w:p>
+    <w:p>
+      <w:r>
+        <w:t>The companion web server is a standalone Rust binary using axum. It shares all business logic with the Tauri app via the core/ library crate.</w:t>
+      </w:r>
+    </w:p>
+    <w:p>
+      <w:r>
+        <w:t>Request pipeline: nginx (optional TLS) → axum router → bearer token middleware → handler → core/ function → JSON response</w:t>
+      </w:r>
+    </w:p>
+    <w:p>
+      <w:r>
+        <w:t>Authentication: single static bearer token checked on every request. Sufficient for personal single-user access; not designed for multi-user deployment.</w:t>
+      </w:r>
+    </w:p>
+    <w:p>
+      <w:r>
+        <w:t>Static file serving: the axum server serves the web build output (dist-web/) at / using tower-http's ServeDir. A single binary serves both the API and the frontend.</w:t>
+      </w:r>
+    </w:p>
+    <w:p>
+      <w:r>
+        <w:t>Vault isolation: the server is locked to a single VAULT_PATH and performs the same path traversal checks as the Tauri backend (no absolute paths, no parent directory traversal).</w:t>
+      </w:r>
+    </w:p>
+    <w:p>
+      <w:r>
+        <w:t>Git operations: shelled out to system git, identical to the desktop app. The vault on the VPS can have its own git remote (e.g. GitHub) for backup and sync.</w:t>
+      </w:r>
+    </w:p>
+    <w:p>
       <w:pPr>
         <w:pStyle w:val="Heading1"/>
       </w:pPr>
@@ -7616,7 +7849,7 @@
           <w:sz w:val="18"/>
           <w:szCs w:val="18"/>
         </w:rPr>
-        <w:t xml:space="preserve">End of Document — Vault PRD v1.2</w:t>
+        <w:t>End of Document — Vault PRD v1.3</w:t>
       </w:r>
     </w:p>
     <w:sectPr>

</xml_diff>